<commit_message>
Coverage playbook and runbook: a study-team handoff method
The playbook opened as an employee's leave plan ("Going on leave for a
month? ... the study lead has peace of mind", "Your credentials/VPN go
idle on leave"). It now reads as a continuity method for a study team,
matching the toolkit: the job owner may be away, hand the job off or
leave; the checklist is the job owner's, and the hand-back starts "when
the owner returns". The footer says "Coverage and continuity". The
"honest limit" callout no longer promises a later "AI hybrid" layer or
"guarantees" delivery.

The coverage runbook's purpose line covers planned leave, an unplanned
absence or a handoff; its Word and PDF exports (and the toolkit's copy
of the PDF) are regenerated. The jobs template says "license".

Co-Authored-By: Claude Opus 5.5 <noreply@anthropic.com>
</commit_message>
<xml_diff>
--- a/sas_r_automation/SAS_R_Coverage_Runbook.docx
+++ b/sas_r_automation/SAS_R_Coverage_Runbook.docx
@@ -22,7 +22,7 @@
         <w:t xml:space="preserve">Purpose.</w:t>
       </w:r>
       <w:r>
-        <w:t xml:space="preserve"> Keep trial monitoring running and self-escalating while the lead biostatistician is on leave. This one page tells the covering colleague (the </w:t>
+        <w:t xml:space="preserve"> Keep trial monitoring running and self-escalating while the job's owner (here, the lead biostatistician) is away, whether for planned leave, an unplanned absence or a handoff. This one page tells the covering colleague (the </w:t>
       </w:r>
       <w:r>
         <w:rPr>
@@ -32,7 +32,7 @@
         <w:t xml:space="preserve">support</w:t>
       </w:r>
       <w:r>
-        <w:t xml:space="preserve">) and the study lead exactly what arrives, what it means, and who does what. It is handed over before departure and committed to version control.</w:t>
+        <w:t xml:space="preserve">) and the study lead exactly what arrives, what it means, and who does what. It is handed over before the absence and committed to version control.</w:t>
       </w:r>
     </w:p>
     <w:p>
@@ -1508,7 +1508,7 @@
                 <w:sz w:val="17"/>
                 <w:szCs w:val="17"/>
               </w:rPr>
-              <w:t xml:space="preserve">Lead (on leave)</w:t>
+              <w:t xml:space="preserve">Lead (away)</w:t>
             </w:r>
           </w:p>
         </w:tc>

</xml_diff>